<commit_message>
v1.6.0: vadeli çekle ödeme, "araç ve iş makinası" ifadesi
- Sözleşme bazında ödeme şekli (vadeli çek / havale-EFT) ve çek vadesi (varsayılan 90 gün)
- Çekle ödemede IBAN isteğe bağlı; çek teslimiyle ödeme sayılır, vadeden önce talep ve vade farkı yok
- Şirketin düzeltmesine göre metinde "iş makinası" -> "araç ve iş makinası"
- sablon_duzenle.py: metin değişiklikleri artık hazır SABLON.docx'e tekrar çalıştırılabilir adımlarla uygulanıyor

Co-Authored-By: Claude Opus 5.5 <noreply@anthropic.com>
</commit_message>
<xml_diff>
--- a/SABLON.docx
+++ b/SABLON.docx
@@ -612,7 +612,7 @@
         <w:t>Kira Ödemelerinin Başlangıç Tarihi:</w:t>
       </w:r>
       <w:r>
-        <w:t xml:space="preserve"> İş makinesinin teslim edildiği ve tüm teknik kontrolleri yapılarak fiilen çalışmaya hazır (operasyonel) hale geldiği, Teslim Tutanağında belirtilen tarihi ifade eder. Kira bedeli bu tarihten itibaren tahakkuk etmeye başlar.  </w:t>
+        <w:t xml:space="preserve"> Araç ve İş makinesinin teslim edildiği ve tüm teknik kontrolleri yapılarak fiilen çalışmaya hazır (operasyonel) hale geldiği, Teslim Tutanağında belirtilen tarihi ifade eder. Kira bedeli bu tarihten itibaren tahakkuk etmeye başlar.  </w:t>
       </w:r>
     </w:p>
     <w:p>
@@ -762,7 +762,7 @@
         <w:t>Operatör:</w:t>
       </w:r>
       <w:r>
-        <w:t> Kiralamaya konu edilen iş makinasının idare, kullanım</w:t>
+        <w:t xml:space="preserve"> Kiralamaya konu edilen araç ve iş makinasının idare, kullanım</w:t>
       </w:r>
       <w:r>
         <w:t xml:space="preserve">ından </w:t>
@@ -846,7 +846,7 @@
         <w:t xml:space="preserve"> KİRALAYAN’da bulunan </w:t>
       </w:r>
       <w:r>
-        <w:t>iş makinesinin</w:t>
+        <w:t>araç ve iş makinesinin</w:t>
       </w:r>
       <w:r>
         <w:t xml:space="preserve">, </w:t>
@@ -907,7 +907,7 @@
       </w:r>
       <w:r>
         <w:rPr/>
-        <w:t>Kiralamaya konu iş makinalarının bilgileri ve makina başına aylık kira bedelleri aşağıdaki tabloda gösterilmiştir. Sözleşmede geçen "Makina" ifadesi tabloda yer alan makinaların her birini ayrı ayrı ve tamamını birlikte kapsar; sözleşme hükümleri (kira kesintisi, gecikme cezası, ikame ve fesih hakları dahil) her makina için ayrı ayrı uygulanır. Tabloda belirtilen teknik özellikler Kiralayanın taahhüdü niteliğinde olup ataşmanlar makinanın ayrılmaz parçası ve kira bedeline dahildir.</w:t>
+        <w:t>Kiralamaya konu araç ve iş makinalarının bilgileri ve makina başına aylık kira bedelleri aşağıdaki tabloda gösterilmiştir. Sözleşmede geçen "Makina" ifadesi tabloda yer alan makinaların her birini ayrı ayrı ve tamamını birlikte kapsar; sözleşme hükümleri (kira kesintisi, gecikme cezası, ikame ve fesih hakları dahil) her makina için ayrı ayrı uygulanır. Tabloda belirtilen teknik özellikler Kiralayanın taahhüdü niteliğinde olup ataşmanlar makinanın ayrılmaz parçası ve kira bedeline dahildir.</w:t>
       </w:r>
     </w:p>
     <w:p>
@@ -1068,7 +1068,7 @@
       <w:r/>
       <w:r>
         <w:rPr/>
-        <w:t>Kiracı, kiralama konusu iş makinesini, sözleşme süresinin dolmasını beklemeksizin, üstlendiği işin/projenin bitmesi</w:t>
+        <w:t>Kiracı, kiralama konusu araç ve iş makinesini, sözleşme süresinin dolmasını beklemeksizin, üstlendiği işin/projenin bitmesi</w:t>
       </w:r>
       <w:r>
         <w:rPr/>
@@ -1305,11 +1305,9 @@
         <w:t xml:space="preserve"> fatura kesimini takip eden 15 gün içerisinde</w:t>
       </w:r>
       <w:r>
-        <w:t xml:space="preserve"> KİRACI tarafından banka yoluyla </w:t>
-      </w:r>
-      <w:r>
-        <w:t>ödenecektir</w:t>
-      </w:r>
+        <w:t xml:space="preserve"> KİRACI tarafından {{ODEME_SEKLI}} ödenecektir</w:t>
+      </w:r>
+      <w:r/>
       <w:r>
         <w:t xml:space="preserve">. </w:t>
       </w:r>
@@ -1357,27 +1355,7 @@
       </w:r>
       <w:r>
         <w:rPr/>
-        <w:t xml:space="preserve">Kira bedelleri yalnızca Kiralayan adına açılmış </w:t>
-      </w:r>
-      <w:r>
-        <w:rPr>
-          <w:b/>
-        </w:rPr>
-        <w:t>{{K_BANKA}}</w:t>
-      </w:r>
-      <w:r>
-        <w:rPr/>
-        <w:t xml:space="preserve"> nezdindeki </w:t>
-      </w:r>
-      <w:r>
-        <w:rPr>
-          <w:b/>
-        </w:rPr>
-        <w:t>{{K_IBAN}}</w:t>
-      </w:r>
-      <w:r>
-        <w:rPr/>
-        <w:t xml:space="preserve"> IBAN numaralı hesaba ödenir. Kiralayan, hesap bilgisindeki değişikliği imzalı yazı ile bildirmedikçe bu hesaba yapılan ödemeler geçerli ve borçtan kurtarıcıdır; üçüncü kişi adına açılmış hesaplara ödeme talep edilemez.</w:t>
+        <w:t>{{ODEME_EK}}</w:t>
       </w:r>
     </w:p>
     <w:p>
@@ -1410,7 +1388,7 @@
       </w:r>
       <w:r/>
       <w:r>
-        <w:t xml:space="preserve">İş makinasının teslim yerine </w:t>
+        <w:t xml:space="preserve">Araç ve İş makinasının teslim yerine </w:t>
       </w:r>
       <w:r>
         <w:t xml:space="preserve">güvenli şekilde </w:t>
@@ -1580,7 +1558,7 @@
         <w:tab/>
       </w:r>
       <w:r>
-        <w:t>Kiralayan; kiralamaya konu edilen iş makin</w:t>
+        <w:t>Kiralayan; kiralamaya konu edilen araç ve iş makin</w:t>
       </w:r>
       <w:r>
         <w:t>asının</w:t>
@@ -1642,7 +1620,7 @@
         </w:rPr>
       </w:r>
       <w:r>
-        <w:t>Kiralayan iş makinasının kullanımın</w:t>
+        <w:t>Kiralayan araç ve iş makinasının kullanımın</w:t>
       </w:r>
       <w:r>
         <w:t>ın</w:t>
@@ -1773,19 +1751,19 @@
         </w:rPr>
       </w:r>
       <w:r>
-        <w:t>Kiralamaya konu edilen iş makinasının, gerek kanunun belirlediği gerekse de aktif ve düzgün çalışmasına matuf periyodik bakımlarının zamanında ve gereği gibi yapılmasından</w:t>
+        <w:t>Kiralamaya konu edilen araç ve iş makinasının, gerek kanunun belirlediği gerekse de aktif ve düzgün çalışmasına matuf periyodik bakımlarının zamanında ve gereği gibi yapılmasından</w:t>
       </w:r>
       <w:r>
         <w:t xml:space="preserve">, değişimi zaruri/faydalı parçalarının ikmal ve değiştirilmesinden </w:t>
       </w:r>
       <w:r>
-        <w:t>Kiralayan mesuldür. Buna ek olarak iş makinası dahilinde her türlü tamir, onarım, yedek parça tedariki, lastik değişimi</w:t>
+        <w:t>Kiralayan mesuldür. Buna ek olarak araç ve iş makinası dahilinde her türlü tamir, onarım, yedek parça tedariki, lastik değişimi</w:t>
       </w:r>
       <w:r>
         <w:t xml:space="preserve">(normal aşınma dahil) </w:t>
       </w:r>
       <w:r>
-        <w:t xml:space="preserve"> Kiracının talebi ile bağlı kalınmaksızın Kiralayan tarafından iş makinasının kullanımını sekteye uğratmayacak şekilde yapılmalı ve işbu kalemlere ilişkin giderler ile MTV, ZMS ve muayene ücretleri kiralayan tarafından karşılanmalıdır. </w:t>
+        <w:t xml:space="preserve"> Kiracının talebi ile bağlı kalınmaksızın Kiralayan tarafından araç ve iş makinasının kullanımını sekteye uğratmayacak şekilde yapılmalı ve işbu kalemlere ilişkin giderler ile MTV, ZMS ve muayene ücretleri kiralayan tarafından karşılanmalıdır. </w:t>
       </w:r>
       <w:r>
         <w:t>Kiracının kiralayana yönelttiği bahsi geçen nitelikte</w:t>
@@ -1897,7 +1875,7 @@
         <w:tab/>
       </w:r>
       <w:r>
-        <w:t>İş Makinasının kira süresince iş yerindeki kullanımı dahilinde tüketilen tüm yakıt giderleri Kiracı tarafından karşılanacaktır.</w:t>
+        <w:t>Araç ve İş Makinasının kira süresince iş yerindeki kullanımı dahilinde tüketilen tüm yakıt giderleri Kiracı tarafından karşılanacaktır.</w:t>
       </w:r>
       <w:r>
         <w:rPr>
@@ -1933,7 +1911,7 @@
         <w:tab/>
       </w:r>
       <w:r>
-        <w:t>Kiralamaya konu edilen iş makinası</w:t>
+        <w:t>Kiralamaya konu edilen araç ve iş makinası</w:t>
       </w:r>
       <w:r>
         <w:t>nın kullanı</w:t>
@@ -1971,7 +1949,7 @@
         <w:tab/>
       </w:r>
       <w:r>
-        <w:t xml:space="preserve">Kiracı; iş makinası dahilinde gerek teslim ve/veya iade gerekse de kullanım sürecinde tespit ettiği arıza ayıp ve/veya eksiklikleri Kiralayana yazılı surette bildirmekle mükelleftir. </w:t>
+        <w:t xml:space="preserve">Kiracı; araç ve iş makinası dahilinde gerek teslim ve/veya iade gerekse de kullanım sürecinde tespit ettiği arıza ayıp ve/veya eksiklikleri Kiralayana yazılı surette bildirmekle mükelleftir. </w:t>
       </w:r>
     </w:p>
     <w:p>
@@ -2104,7 +2082,7 @@
       </w:r>
       <w:r>
         <w:rPr/>
-        <w:t>iş makinesinin kullanımına kanuni ve mesleki kalifikasyona ve ehliyetlere (E sınıfı, SRC, Psikoteknik vb.) sahip şoför/ personeli tahsis etmekle mükelleftir. İşbu operatör</w:t>
+        <w:t>araç ve iş makinesinin kullanımına kanuni ve mesleki kalifikasyona ve ehliyetlere (E sınıfı, SRC, Psikoteknik vb.) sahip şoför/ personeli tahsis etmekle mükelleftir. İşbu operatör</w:t>
       </w:r>
       <w:r>
         <w:rPr/>
@@ -2116,7 +2094,7 @@
       </w:r>
       <w:r>
         <w:rPr/>
-        <w:t>Kiralayan; iş makinasının kullanımına mahsus tüm dökümantasyonu</w:t>
+        <w:t>Kiralayan; araç ve iş makinasının kullanımına mahsus tüm dökümantasyonu</w:t>
       </w:r>
       <w:r>
         <w:rPr/>
@@ -2247,7 +2225,7 @@
         <w:t> </w:t>
       </w:r>
       <w:r>
-        <w:t>ve iş makinasının teknik hukuki yeterliliğine ilişkin belge suretleri</w:t>
+        <w:t>ve araç ve iş makinasının teknik hukuki yeterliliğine ilişkin belge suretleri</w:t>
       </w:r>
       <w:r>
         <w:t xml:space="preserve">, </w:t>
@@ -2267,10 +2245,10 @@
         <w:t>Tutanak imzalanmadan yapılan fiili kullanımlar, KİRALAYAN'ın sorumluluğunu ortadan kaldırmaz. </w:t>
       </w:r>
       <w:r>
-        <w:t>İ</w:t>
-      </w:r>
-      <w:r>
-        <w:t>ş makinasının teslim anında taahhüt edilen nitelik ve niceliği taşımadığının anlaşılması,</w:t>
+        <w:t>Araç ve İş</w:t>
+      </w:r>
+      <w:r>
+        <w:t xml:space="preserve"> makinasının teslim anında taahhüt edilen nitelik ve niceliği taşımadığının anlaşılması,</w:t>
       </w:r>
       <w:r>
         <w:t xml:space="preserve"> ayıplı veya arızalı olduğunun tespiti halinde </w:t>
@@ -2305,7 +2283,7 @@
         <w:tab/>
       </w:r>
       <w:r>
-        <w:t xml:space="preserve">İş makinasının iade sürecinde de benzer şekilde gereken yetkileri haiz kişilerin bizzat iştiraki ile tutanak dahilinde iade süreci tamamlanacaktır. </w:t>
+        <w:t xml:space="preserve">Araç ve İş makinasının iade sürecinde de benzer şekilde gereken yetkileri haiz kişilerin bizzat iştiraki ile tutanak dahilinde iade süreci tamamlanacaktır. </w:t>
       </w:r>
     </w:p>
     <w:p>
@@ -2352,7 +2330,7 @@
         <w:t xml:space="preserve"> kiralayan aleyhine,</w:t>
       </w:r>
       <w:r>
-        <w:t xml:space="preserve"> iş makinasının çalışmadığı/kullanılamadığı </w:t>
+        <w:t xml:space="preserve"> araç ve iş makinasının çalışmadığı/kullanılamadığı </w:t>
       </w:r>
       <w:r>
         <w:t>süreler</w:t>
@@ -2380,7 +2358,7 @@
       <w:r>
         <w:t>–</w:t>
         <w:tab/>
-        <w:t>İş Makinasının, kararlaştırılan tarihte iş yerinde teslim edilmemesi</w:t>
+        <w:t>Araç ve İş Makinasının, kararlaştırılan tarihte iş yerinde teslim edilmemesi</w:t>
       </w:r>
       <w:r>
         <w:t xml:space="preserve">, </w:t>
@@ -2399,7 +2377,7 @@
       <w:r>
         <w:t>–</w:t>
         <w:tab/>
-        <w:t>Teslim anında; iş makinasının gerekli nitelik ve nicelikte olmadığının, arızalı ve/veya ayıplı olduğunun anlaşılması</w:t>
+        <w:t>Teslim anında; araç ve iş makinasının gerekli nitelik ve nicelikte olmadığının, arızalı ve/veya ayıplı olduğunun anlaşılması</w:t>
       </w:r>
       <w:r>
         <w:t xml:space="preserve"> ve bu hususta tespiti </w:t>
@@ -2527,7 +2505,7 @@
         <w:rPr/>
         <w:t>–</w:t>
         <w:tab/>
-        <w:t>Zikredilmemekle birlikte iş makinasının kiracı tarafından işletilmesine engel nitelikte sayılabilecek ve/veya tehlike/şaibe yaratabilecek her hangi bir hususun varlığı ile işbu durumun 24 saat içinde giderilmemesi halinde;</w:t>
+        <w:t>Zikredilmemekle birlikte araç ve iş makinasının kiracı tarafından işletilmesine engel nitelikte sayılabilecek ve/veya tehlike/şaibe yaratabilecek her hangi bir hususun varlığı ile işbu durumun 24 saat içinde giderilmemesi halinde;</w:t>
       </w:r>
       <w:r>
         <w:t xml:space="preserve"> </w:t>
@@ -2542,7 +2520,7 @@
       </w:pPr>
       <w:r>
         <w:rPr/>
-        <w:t>İş makinasının kullanımından mah</w:t>
+        <w:t>Araç ve İş makinasının kullanımından mah</w:t>
       </w:r>
       <w:r>
         <w:rPr/>
@@ -2626,7 +2604,7 @@
         <w:t xml:space="preserve">hallerde </w:t>
       </w:r>
       <w:r>
-        <w:t xml:space="preserve">veya benzer şekilde İş makinasının kaza yapması veya bakıma girmesi nedeniyle hizmet dışı kaldığı durumlarda; KİRALAYAN, en geç 24 saat içinde aynı teknik özelliklere sahip muadil bir aracı (ikame araç) ücretsiz olarak tahsis etmek zorundadır. </w:t>
+        <w:t xml:space="preserve">veya benzer şekilde Araç ve İş makinasının kaza yapması veya bakıma girmesi nedeniyle hizmet dışı kaldığı durumlarda; KİRALAYAN, en geç 24 saat içinde aynı teknik özelliklere sahip muadil bir aracı (ikame araç) ücretsiz olarak tahsis etmek zorundadır. </w:t>
       </w:r>
     </w:p>
     <w:p>
@@ -2638,7 +2616,7 @@
       </w:pPr>
       <w:r>
         <w:rPr/>
-        <w:t xml:space="preserve">Yukarıda belirtilen ve/Veya kiralayandan sadır sebeplerle iş makinasının kullanılmasının mümkün olmadığı ve/veya tehlike içerdiği her durumda </w:t>
+        <w:t xml:space="preserve">Yukarıda belirtilen ve/Veya kiralayandan sadır sebeplerle araç ve iş makinasının kullanılmasının mümkün olmadığı ve/veya tehlike içerdiği her durumda </w:t>
       </w:r>
       <w:r>
         <w:rPr/>
@@ -2687,7 +2665,7 @@
         <w:jc w:val="both"/>
       </w:pPr>
       <w:r>
-        <w:t>Herhangi bir surette; İş makinasının kullanımından mah</w:t>
+        <w:t>Herhangi bir surette; Araç ve İş makinasının kullanımından mah</w:t>
       </w:r>
       <w:r>
         <w:t>rum</w:t>
@@ -2765,7 +2743,7 @@
           <w:b/>
           <w:bCs/>
         </w:rPr>
-        <w:t xml:space="preserve">Ruhsatlı İş Makineleri İçin, </w:t>
+        <w:t xml:space="preserve">Ruhsatlı Araç ve İş Makineleri İçin, </w:t>
       </w:r>
       <w:r>
         <w:t xml:space="preserve">Zorunlu Mali Sorumluluk (Trafik) Sigorta </w:t>
@@ -2894,7 +2872,7 @@
         <w:t>K</w:t>
       </w:r>
       <w:r>
-        <w:t xml:space="preserve">iralamaya konu edilen iş makinasının gerektirdiği yukarıda belirtilen sigortaların yapılmaması ve/veya </w:t>
+        <w:t xml:space="preserve">iralamaya konu edilen araç ve iş makinasının gerektirdiği yukarıda belirtilen sigortaların yapılmaması ve/veya </w:t>
       </w:r>
       <w:r>
         <w:t xml:space="preserve">eksik sigorta yapılması/ </w:t>
@@ -3527,7 +3505,7 @@
         </w:rPr>
       </w:r>
       <w:r>
-        <w:t>Kiralamaya konu edilen iş makinasının gerektirdiği sözleşme dahilinde belirtilen sigortaların yapılmaması ve/veya eksik sigorta yapılması/ sigorta poliçe primlerinin ödenmemesi ve/veya poliçelerin uzatılmaması/ erken iptal edilmesi hallerinde</w:t>
+        <w:t>Kiralamaya konu edilen araç ve iş makinasının gerektirdiği sözleşme dahilinde belirtilen sigortaların yapılmaması ve/veya eksik sigorta yapılması/ sigorta poliçe primlerinin ödenmemesi ve/veya poliçelerin uzatılmaması/ erken iptal edilmesi hallerinde</w:t>
       </w:r>
     </w:p>
     <w:p>
@@ -3945,7 +3923,7 @@
         <w:rPr>
           <w:lang w:val="tr"/>
         </w:rPr>
-        <w:t>Gerek işbu sözleşmenin imza tarihinde gerek iş makinasının teslim tarihinde gerekse de sonradan sunulacak aşağıda yer alan</w:t>
+        <w:t>Gerek işbu sözleşmenin imza tarihinde gerek araç ve iş makinasının teslim tarihinde gerekse de sonradan sunulacak aşağıda yer alan</w:t>
       </w:r>
       <w:r>
         <w:rPr>
@@ -3999,7 +3977,7 @@
         </w:rPr>
       </w:pPr>
       <w:r>
-        <w:t>İş</w:t>
+        <w:t>Araç ve İş</w:t>
       </w:r>
       <w:r>
         <w:t xml:space="preserve"> makinesi ruhsat fotokopisi</w:t>
@@ -4026,7 +4004,7 @@
         </w:rPr>
       </w:pPr>
       <w:r>
-        <w:t>İş Makinasının nitelik ve niceliğini ortaya koyan sertifikasyonlar, test ve muayene raporları</w:t>
+        <w:t>Araç ve İş Makinasının nitelik ve niceliğini ortaya koyan sertifikasyonlar, test ve muayene raporları</w:t>
       </w:r>
       <w:r>
         <w:t xml:space="preserve">, kullanım talimatnamesi </w:t>

</xml_diff>

<commit_message>
v1.7.0: kiralama türü, logolar ilk sayfada, altbilgide yalnızca sayfa no
- Sözleşme bazında operatörsüz/şoförsüz ya da operatörlü/şoförlü (3.1 ve 6.2.6 buna göre)
- Logolar sayfa başlığı yerine belgenin en üstünde: yalnızca ilk sayfada
- Altbilgide yalnızca "Sayfa X / Y"; sözleşme no belgede (altbilgi, tutanak) yazılmıyor

Co-Authored-By: Claude Opus 5.5 <noreply@anthropic.com>
</commit_message>
<xml_diff>
--- a/SABLON.docx
+++ b/SABLON.docx
@@ -859,7 +859,7 @@
           <w:b/>
           <w:bCs/>
         </w:rPr>
-        <w:t>operatörsüz (şoförsüz) olarak</w:t>
+        <w:t>{{KIRALAMA_TURU}} olarak</w:t>
       </w:r>
       <w:r>
         <w:rPr/>
@@ -2043,70 +2043,13 @@
       <w:r>
         <w:rPr>
           <w:b/>
-          <w:bCs/>
         </w:rPr>
         <w:t>6.2.6.</w:t>
         <w:tab/>
       </w:r>
       <w:r>
-        <w:rPr>
-          <w:b/>
-          <w:bCs/>
-        </w:rPr>
-      </w:r>
-      <w:r>
-        <w:rPr>
-          <w:b/>
-          <w:bCs/>
-        </w:rPr>
-      </w:r>
-      <w:r>
-        <w:rPr>
-          <w:b/>
-          <w:bCs/>
-        </w:rPr>
-      </w:r>
-      <w:r>
-        <w:rPr>
-          <w:b/>
-          <w:bCs/>
-        </w:rPr>
-      </w:r>
-      <w:r>
-        <w:rPr/>
-        <w:t>Sözleşme süresince kira</w:t>
-      </w:r>
-      <w:r>
-        <w:rPr/>
-        <w:t xml:space="preserve">cı; </w:t>
-      </w:r>
-      <w:r>
-        <w:rPr/>
-        <w:t>araç ve iş makinesinin kullanımına kanuni ve mesleki kalifikasyona ve ehliyetlere (E sınıfı, SRC, Psikoteknik vb.) sahip şoför/ personeli tahsis etmekle mükelleftir. İşbu operatör</w:t>
-      </w:r>
-      <w:r>
-        <w:rPr/>
-        <w:t xml:space="preserve">; kullanıma tahsis edilen makinayı özenli ve dikkatli şekilde kullanmakla mükelleftir. </w:t>
-      </w:r>
-      <w:r>
-        <w:rPr/>
-        <w:t xml:space="preserve"> </w:t>
-      </w:r>
-      <w:r>
-        <w:rPr/>
-        <w:t>Kiralayan; araç ve iş makinasının kullanımına mahsus tüm dökümantasyonu</w:t>
-      </w:r>
-      <w:r>
-        <w:rPr/>
-        <w:t>, kullanım talimatnamesini</w:t>
-      </w:r>
-      <w:r>
-        <w:rPr/>
-        <w:t xml:space="preserve"> kiracı ile paylaşmak, önem arz eden hususları yazılı surette kiracı</w:t>
-      </w:r>
-      <w:r>
-        <w:rPr/>
-        <w:t xml:space="preserve">ya bildirmeyi üstlenmiştir. </w:t>
+        <w:rPr/>
+        <w:t>{{OPERATOR_HUKMU}}</w:t>
       </w:r>
     </w:p>
     <w:p>
@@ -4375,57 +4318,25 @@
   <w:p>
     <w:pPr>
       <w:pStyle w:val="footer"/>
-      <w:tabs>
-        <w:tab w:pos="4677" w:val="center"/>
-        <w:tab w:pos="9354" w:val="right"/>
-      </w:tabs>
       <w:spacing w:after="0"/>
-      <w:pBdr>
-        <w:top w:val="single" w:sz="4" w:space="4" w:color="A6A6A6"/>
-      </w:pBdr>
+      <w:jc w:val="center"/>
     </w:pPr>
     <w:r>
-      <w:rPr>
-        <w:sz w:val="16"/>
-        <w:color w:val="595959"/>
-      </w:rPr>
-      <w:t>Sözleşme No: {{SOZ_NO}}</w:t>
-      <w:tab/>
       <w:t xml:space="preserve">Sayfa </w:t>
     </w:r>
     <w:fldSimple w:instr="PAGE">
       <w:r>
-        <w:rPr>
-          <w:sz w:val="16"/>
-          <w:color w:val="595959"/>
-        </w:rPr>
         <w:t>1</w:t>
       </w:r>
     </w:fldSimple>
     <w:r>
-      <w:rPr>
-        <w:sz w:val="16"/>
-        <w:color w:val="595959"/>
-      </w:rPr>
       <w:t xml:space="preserve"> / </w:t>
     </w:r>
     <w:fldSimple w:instr="NUMPAGES">
       <w:r>
-        <w:rPr>
-          <w:sz w:val="16"/>
-          <w:color w:val="595959"/>
-        </w:rPr>
         <w:t>1</w:t>
       </w:r>
     </w:fldSimple>
-    <w:r>
-      <w:rPr>
-        <w:sz w:val="16"/>
-        <w:color w:val="595959"/>
-      </w:rPr>
-      <w:tab/>
-      <w:t>Paraf:  Kiralayan ________   Kiracı ________</w:t>
-    </w:r>
   </w:p>
 </w:ftr>
 </file>

</xml_diff>

<commit_message>
v1.7.1: Vergi No zorunlu / TC isteğe bağlı, daha hızlı açılış
- Kiralayan: Vergi No her zaman yazılır ve zorunlu; T.C. Kimlik No isteğe bağlı ayrı satır
- Açılış: PyInstaller açılış kartı anında görünür, python-docx geç yüklenir, openpyxl exe'den
  çıkarıldı, gereksiz Edge servisleri kapatıldı, açılış ekranında asgari bekleme kaldırıldı

Co-Authored-By: Claude Opus 5.5 <noreply@anthropic.com>
</commit_message>
<xml_diff>
--- a/SABLON.docx
+++ b/SABLON.docx
@@ -103,7 +103,6 @@
       </w:r>
       <w:r>
         <w:rPr/>
-        <w:t xml:space="preserve">   {{K_KIMLIK}}</w:t>
       </w:r>
     </w:p>
     <w:p>
@@ -249,6 +248,33 @@
       <w:r/>
       <w:r>
         <w:t>{{K_VN}}</w:t>
+      </w:r>
+    </w:p>
+    <w:p>
+      <w:pPr>
+        <w:tabs>
+          <w:tab w:pos="2381" w:val="left"/>
+        </w:tabs>
+        <w:spacing w:line="276" w:lineRule="auto" w:before="0" w:after="40"/>
+        <w:ind w:left="2608" w:hanging="2041"/>
+        <w:jc w:val="left"/>
+      </w:pPr>
+      <w:r>
+        <w:rPr>
+          <w:b/>
+        </w:rPr>
+        <w:t>T.C. Kimlik No</w:t>
+      </w:r>
+      <w:r>
+        <w:rPr>
+          <w:b/>
+        </w:rPr>
+        <w:tab/>
+        <w:t xml:space="preserve">: </w:t>
+      </w:r>
+      <w:r>
+        <w:rPr/>
+        <w:t>{{?K_TCKN}}</w:t>
       </w:r>
     </w:p>
     <w:p>

</xml_diff>